<commit_message>
Address external review feedback on PCB brief
- Upgrade LDO: AMS1117-3.3 → AP2112K-3.3 (55µA Iq vs 5mA,
  modern low-dropout, stable without large bulk cap)
- Add ESD protection on all 4 sensor headers: 100Ω series
  resistor + PESD3V3L1BA TVS diode per input
- Clean up op-amp topology explanation; reference Tekscan
  Integration Guide Figure 4 for exact polarity/biasing
- Fix stale "off-board breakout via socket" reference in
  I²C address table; now correctly reads "LGA-28 on-board"
- Clarify BOM intro: only off-board parts are FlexiForce sensors

Co-Authored-By: Claude Opus 4.6 <noreply@anthropic.com>
</commit_message>
<xml_diff>
--- a/hardware/documentation/PCB_V2_REDESIGN_BRIEF.docx
+++ b/hardware/documentation/PCB_V2_REDESIGN_BRIEF.docx
@@ -28,7 +28,7 @@
         </w:p>
       </w:sdtContent>
     </w:sdt>
-    <w:bookmarkStart w:id="49" w:name="X2a21c44c20fa4698356a4cf1fe30fca75cdf0e5"/>
+    <w:bookmarkStart w:id="50" w:name="X2a21c44c20fa4698356a4cf1fe30fca75cdf0e5"/>
     <w:p>
       <w:pPr>
         <w:pStyle w:val="Heading1"/>
@@ -563,7 +563,7 @@
         <w:rPr>
           <w:rStyle w:val="VerbatimChar"/>
         </w:rPr>
-        <w:t xml:space="preserve">       ├─ AMS1117-3.3 LDO (U1) ── 3.3V rail</w:t>
+        <w:t xml:space="preserve">       ├─ AP2112K-3.3 LDO (U1) ── 3.3V rail</w:t>
       </w:r>
       <w:r>
         <w:br/>
@@ -816,13 +816,46 @@
     </w:p>
     <w:p>
       <w:pPr>
+        <w:pStyle w:val="BodyText"/>
+      </w:pPr>
+      <w:r>
+        <w:t xml:space="preserve">The topology follows the</w:t>
+      </w:r>
+      <w:r>
+        <w:t xml:space="preserve"> </w:t>
+      </w:r>
+      <w:r>
+        <w:rPr>
+          <w:b/>
+          <w:bCs/>
+        </w:rPr>
+        <w:t xml:space="preserve">Tekscan FlexiForce Integration Guide, Figure 4</w:t>
+      </w:r>
+      <w:r>
+        <w:t xml:space="preserve"> </w:t>
+      </w:r>
+      <w:r>
+        <w:t xml:space="preserve">(</w:t>
+      </w:r>
+      <w:r>
+        <w:t xml:space="preserve">“Inverting Amplifier”</w:t>
+      </w:r>
+      <w:r>
+        <w:t xml:space="preserve"> </w:t>
+      </w:r>
+      <w:r>
+        <w:t xml:space="preserve">reference circuit). Per channel:</w:t>
+      </w:r>
+    </w:p>
+    <w:p>
+      <w:pPr>
         <w:pStyle w:val="SourceCode"/>
       </w:pPr>
       <w:r>
         <w:rPr>
           <w:rStyle w:val="VerbatimChar"/>
         </w:rPr>
-        <w:t xml:space="preserve">                       Rf (feedback resistor)</w:t>
+        <w:t xml:space="preserve">  ┌─────────── Rf (10 kΩ) ──────────┐</w:t>
       </w:r>
       <w:r>
         <w:br/>
@@ -831,7 +864,7 @@
         <w:rPr>
           <w:rStyle w:val="VerbatimChar"/>
         </w:rPr>
-        <w:t xml:space="preserve">                    ┌──────────────────────────┐</w:t>
+        <w:t xml:space="preserve">  │                                 │</w:t>
       </w:r>
       <w:r>
         <w:br/>
@@ -840,7 +873,7 @@
         <w:rPr>
           <w:rStyle w:val="VerbatimChar"/>
         </w:rPr>
-        <w:t xml:space="preserve">                    │                          │</w:t>
+        <w:t xml:space="preserve">  │        ┌───────────────┐        │</w:t>
       </w:r>
       <w:r>
         <w:br/>
@@ -849,7 +882,7 @@
         <w:rPr>
           <w:rStyle w:val="VerbatimChar"/>
         </w:rPr>
-        <w:t xml:space="preserve">                    │      ┌──────────┐        │</w:t>
+        <w:t xml:space="preserve">Vref ──────┤(–)             ├───────┴──────┬──── Vout → ADS1115 input (A0–A3)</w:t>
       </w:r>
       <w:r>
         <w:br/>
@@ -858,7 +891,7 @@
         <w:rPr>
           <w:rStyle w:val="VerbatimChar"/>
         </w:rPr>
-        <w:t xml:space="preserve"> Vref ─── Rd ──────┤(-)   │  1/4 of  │  (out) ├───── ADS1115 input (A0-A3)</w:t>
+        <w:t xml:space="preserve">           │   MCP6004      │              │</w:t>
       </w:r>
       <w:r>
         <w:br/>
@@ -867,7 +900,7 @@
         <w:rPr>
           <w:rStyle w:val="VerbatimChar"/>
         </w:rPr>
-        <w:t xml:space="preserve">  │                │      │  MCP6004 │        │</w:t>
+        <w:t xml:space="preserve">    ┌──────┤(+)  (1 of 4)   │              Cf (100 pF, optional)</w:t>
       </w:r>
       <w:r>
         <w:br/>
@@ -876,7 +909,7 @@
         <w:rPr>
           <w:rStyle w:val="VerbatimChar"/>
         </w:rPr>
-        <w:t xml:space="preserve">  │   FlexiForce   │(+)   │          │        │</w:t>
+        <w:t xml:space="preserve">    │      └───────────────┘               │</w:t>
       </w:r>
       <w:r>
         <w:br/>
@@ -885,7 +918,7 @@
         <w:rPr>
           <w:rStyle w:val="VerbatimChar"/>
         </w:rPr>
-        <w:t xml:space="preserve">  │   ┌────────┐   │      └──────────┘        │</w:t>
+        <w:t xml:space="preserve">   Vref/2 reference                        GND</w:t>
       </w:r>
       <w:r>
         <w:br/>
@@ -894,7 +927,7 @@
         <w:rPr>
           <w:rStyle w:val="VerbatimChar"/>
         </w:rPr>
-        <w:t xml:space="preserve">  └───┤ sensor ├───┘                           │</w:t>
+        <w:t xml:space="preserve">    │</w:t>
       </w:r>
       <w:r>
         <w:br/>
@@ -903,7 +936,10 @@
         <w:rPr>
           <w:rStyle w:val="VerbatimChar"/>
         </w:rPr>
-        <w:t xml:space="preserve">      └────────┘   │                           │</w:t>
+        <w:t xml:space="preserve">  (mid-rail bias divider)</w:t>
+      </w:r>
+      <w:r>
+        <w:br/>
       </w:r>
       <w:r>
         <w:br/>
@@ -912,7 +948,7 @@
         <w:rPr>
           <w:rStyle w:val="VerbatimChar"/>
         </w:rPr>
-        <w:t xml:space="preserve">                   GND                         │</w:t>
+        <w:t xml:space="preserve">  FlexiForce sensor — wired between Vref (drive node) and the (–) input,</w:t>
       </w:r>
       <w:r>
         <w:br/>
@@ -921,21 +957,38 @@
         <w:rPr>
           <w:rStyle w:val="VerbatimChar"/>
         </w:rPr>
-        <w:t xml:space="preserve">                                          Cf (optional)</w:t>
-      </w:r>
-      <w:r>
-        <w:br/>
-      </w:r>
+        <w:t xml:space="preserve">  replacing the standard input resistor Rin in the inverting configuration.</w:t>
+      </w:r>
+    </w:p>
+    <w:p>
+      <w:pPr>
+        <w:pStyle w:val="FirstParagraph"/>
+      </w:pPr>
       <w:r>
         <w:rPr>
-          <w:rStyle w:val="VerbatimChar"/>
+          <w:b/>
+          <w:bCs/>
         </w:rPr>
-        <w:t xml:space="preserve">                                         100pF</w:t>
-      </w:r>
-    </w:p>
-    <w:p>
-      <w:pPr>
-        <w:pStyle w:val="FirstParagraph"/>
+        <w:t xml:space="preserve">Operating principle:</w:t>
+      </w:r>
+      <w:r>
+        <w:t xml:space="preserve"> </w:t>
+      </w:r>
+      <w:r>
+        <w:t xml:space="preserve">the FlexiForce sits in the position of the inverting-amplifier input resistor. As applied force increases, Rsensor decreases, input current into the summing junction rises, and Vout moves proportionally. The feedback resistor Rf sets the gain (force range). The (+) input is biased to mid-rail (Vref/2) to keep the single-supply op-amp output in the linear region.</w:t>
+      </w:r>
+    </w:p>
+    <w:p>
+      <w:pPr>
+        <w:pStyle w:val="BodyText"/>
+      </w:pPr>
+      <w:r>
+        <w:t xml:space="preserve">Full schematic with exact polarity and biasing: see Tekscan Integration Guide (linked in the Reference Datasheets section). Standard values given below are calibrated for this application.</w:t>
+      </w:r>
+    </w:p>
+    <w:p>
+      <w:pPr>
+        <w:pStyle w:val="BodyText"/>
       </w:pPr>
       <w:r>
         <w:t xml:space="preserve">The op-amp output follows the relation</w:t>
@@ -3326,7 +3379,7 @@
               <w:pStyle w:val="Compact"/>
             </w:pPr>
             <w:r>
-              <w:t xml:space="preserve">Off-board breakout via socket</w:t>
+              <w:t xml:space="preserve">LGA-28 on-board</w:t>
             </w:r>
           </w:p>
         </w:tc>
@@ -4049,6 +4102,250 @@
       </w:pPr>
       <w:r>
         <w:t xml:space="preserve">Power Supply</w:t>
+      </w:r>
+    </w:p>
+    <w:tbl>
+      <w:tblPr>
+        <w:tblStyle w:val="Table"/>
+        <w:tblW w:type="pct" w:w="5000"/>
+        <w:tblLayout w:type="fixed"/>
+        <w:tblLook w:firstRow="1" w:lastRow="0" w:firstColumn="0" w:lastColumn="0" w:noHBand="0" w:noVBand="0" w:val="0020"/>
+      </w:tblPr>
+      <w:tblGrid>
+        <w:gridCol w:w="1980"/>
+        <w:gridCol w:w="1980"/>
+        <w:gridCol w:w="1980"/>
+        <w:gridCol w:w="1980"/>
+      </w:tblGrid>
+      <w:tr>
+        <w:trPr>
+          <w:tblHeader w:val="on"/>
+        </w:trPr>
+        <w:tc>
+          <w:tcPr/>
+          <w:p>
+            <w:pPr>
+              <w:pStyle w:val="Compact"/>
+            </w:pPr>
+            <w:r>
+              <w:t xml:space="preserve">Net</w:t>
+            </w:r>
+          </w:p>
+        </w:tc>
+        <w:tc>
+          <w:tcPr/>
+          <w:p>
+            <w:pPr>
+              <w:pStyle w:val="Compact"/>
+            </w:pPr>
+            <w:r>
+              <w:t xml:space="preserve">Voltage</w:t>
+            </w:r>
+          </w:p>
+        </w:tc>
+        <w:tc>
+          <w:tcPr/>
+          <w:p>
+            <w:pPr>
+              <w:pStyle w:val="Compact"/>
+            </w:pPr>
+            <w:r>
+              <w:t xml:space="preserve">Source</w:t>
+            </w:r>
+          </w:p>
+        </w:tc>
+        <w:tc>
+          <w:tcPr/>
+          <w:p>
+            <w:pPr>
+              <w:pStyle w:val="Compact"/>
+            </w:pPr>
+            <w:r>
+              <w:t xml:space="preserve">Notes</w:t>
+            </w:r>
+          </w:p>
+        </w:tc>
+      </w:tr>
+      <w:tr>
+        <w:tc>
+          <w:tcPr/>
+          <w:p>
+            <w:pPr>
+              <w:pStyle w:val="Compact"/>
+            </w:pPr>
+            <w:r>
+              <w:t xml:space="preserve">5V_USB</w:t>
+            </w:r>
+          </w:p>
+        </w:tc>
+        <w:tc>
+          <w:tcPr/>
+          <w:p>
+            <w:pPr>
+              <w:pStyle w:val="Compact"/>
+            </w:pPr>
+            <w:r>
+              <w:t xml:space="preserve">5.0V</w:t>
+            </w:r>
+          </w:p>
+        </w:tc>
+        <w:tc>
+          <w:tcPr/>
+          <w:p>
+            <w:pPr>
+              <w:pStyle w:val="Compact"/>
+            </w:pPr>
+            <w:r>
+              <w:t xml:space="preserve">USB-C connector</w:t>
+            </w:r>
+          </w:p>
+        </w:tc>
+        <w:tc>
+          <w:tcPr/>
+          <w:p>
+            <w:pPr>
+              <w:pStyle w:val="Compact"/>
+            </w:pPr>
+            <w:r>
+              <w:t xml:space="preserve">Max 500 mA per USB spec</w:t>
+            </w:r>
+          </w:p>
+        </w:tc>
+      </w:tr>
+      <w:tr>
+        <w:tc>
+          <w:tcPr/>
+          <w:p>
+            <w:pPr>
+              <w:pStyle w:val="Compact"/>
+            </w:pPr>
+            <w:r>
+              <w:t xml:space="preserve">3V3</w:t>
+            </w:r>
+          </w:p>
+        </w:tc>
+        <w:tc>
+          <w:tcPr/>
+          <w:p>
+            <w:pPr>
+              <w:pStyle w:val="Compact"/>
+            </w:pPr>
+            <w:r>
+              <w:t xml:space="preserve">3.3V</w:t>
+            </w:r>
+          </w:p>
+        </w:tc>
+        <w:tc>
+          <w:tcPr/>
+          <w:p>
+            <w:pPr>
+              <w:pStyle w:val="Compact"/>
+            </w:pPr>
+            <w:r>
+              <w:t xml:space="preserve">AP2112K-3.3 LDO</w:t>
+            </w:r>
+          </w:p>
+        </w:tc>
+        <w:tc>
+          <w:tcPr/>
+          <w:p>
+            <w:pPr>
+              <w:pStyle w:val="Compact"/>
+            </w:pPr>
+            <w:r>
+              <w:t xml:space="preserve">600 mA capacity; 55 µA quiescent; typical draw &lt;200 mA</w:t>
+            </w:r>
+          </w:p>
+        </w:tc>
+      </w:tr>
+      <w:tr>
+        <w:tc>
+          <w:tcPr/>
+          <w:p>
+            <w:pPr>
+              <w:pStyle w:val="Compact"/>
+            </w:pPr>
+            <w:r>
+              <w:t xml:space="preserve">GND</w:t>
+            </w:r>
+          </w:p>
+        </w:tc>
+        <w:tc>
+          <w:tcPr/>
+          <w:p>
+            <w:pPr>
+              <w:pStyle w:val="Compact"/>
+            </w:pPr>
+            <w:r>
+              <w:t xml:space="preserve">0V</w:t>
+            </w:r>
+          </w:p>
+        </w:tc>
+        <w:tc>
+          <w:tcPr/>
+          <w:p>
+            <w:pPr>
+              <w:pStyle w:val="Compact"/>
+            </w:pPr>
+            <w:r>
+              <w:t xml:space="preserve">Continuous ground plane</w:t>
+            </w:r>
+          </w:p>
+        </w:tc>
+        <w:tc>
+          <w:tcPr/>
+          <w:p>
+            <w:pPr>
+              <w:pStyle w:val="Compact"/>
+            </w:pPr>
+          </w:p>
+        </w:tc>
+      </w:tr>
+    </w:tbl>
+    <w:p>
+      <w:pPr>
+        <w:pStyle w:val="BodyText"/>
+      </w:pPr>
+      <w:r>
+        <w:t xml:space="preserve">Decoupling: 100nF + 10µF on LDO input and output. 100nF per IC VDD pin placed within 5mm.</w:t>
+      </w:r>
+    </w:p>
+    <w:p>
+      <w:r>
+        <w:pict>
+          <v:rect style="width:0;height:1.5pt" o:hralign="center" o:hrstd="t" o:hr="t"/>
+        </w:pict>
+      </w:r>
+    </w:p>
+    <w:bookmarkEnd w:id="25"/>
+    <w:bookmarkEnd w:id="26"/>
+    <w:bookmarkStart w:id="28" w:name="sensor-connectors"/>
+    <w:p>
+      <w:pPr>
+        <w:pStyle w:val="Heading2"/>
+      </w:pPr>
+      <w:r>
+        <w:t xml:space="preserve">Sensor Connectors</w:t>
+      </w:r>
+    </w:p>
+    <w:p>
+      <w:pPr>
+        <w:pStyle w:val="FirstParagraph"/>
+      </w:pPr>
+      <w:r>
+        <w:rPr>
+          <w:b/>
+          <w:bCs/>
+        </w:rPr>
+        <w:t xml:space="preserve">4× 2-pin 2.54mm female through-hole headers (J2–J5)</w:t>
+      </w:r>
+    </w:p>
+    <w:p>
+      <w:pPr>
+        <w:pStyle w:val="BodyText"/>
+      </w:pPr>
+      <w:r>
+        <w:t xml:space="preserve">The FlexiForce A301 terminates in 2 male square pins at 0.1” pitch. These plug directly into standard 2-pin female headers on the PCB — no adapter cables, no soldering to the sensor, easy swap for replacement.</w:t>
       </w:r>
     </w:p>
     <w:tbl>
@@ -4074,176 +4371,225 @@
               <w:pStyle w:val="Compact"/>
             </w:pPr>
             <w:r>
-              <w:t xml:space="preserve">Net</w:t>
-            </w:r>
-          </w:p>
-        </w:tc>
-        <w:tc>
-          <w:tcPr/>
-          <w:p>
-            <w:pPr>
-              <w:pStyle w:val="Compact"/>
-            </w:pPr>
-            <w:r>
-              <w:t xml:space="preserve">Voltage</w:t>
-            </w:r>
-          </w:p>
-        </w:tc>
-        <w:tc>
-          <w:tcPr/>
-          <w:p>
-            <w:pPr>
-              <w:pStyle w:val="Compact"/>
-            </w:pPr>
-            <w:r>
-              <w:t xml:space="preserve">Source</w:t>
-            </w:r>
-          </w:p>
-        </w:tc>
-        <w:tc>
-          <w:tcPr/>
-          <w:p>
-            <w:pPr>
-              <w:pStyle w:val="Compact"/>
-            </w:pPr>
-            <w:r>
-              <w:t xml:space="preserve">Notes</w:t>
-            </w:r>
-          </w:p>
-        </w:tc>
-      </w:tr>
-      <w:tr>
-        <w:tc>
-          <w:tcPr/>
-          <w:p>
-            <w:pPr>
-              <w:pStyle w:val="Compact"/>
-            </w:pPr>
-            <w:r>
-              <w:t xml:space="preserve">5V_USB</w:t>
-            </w:r>
-          </w:p>
-        </w:tc>
-        <w:tc>
-          <w:tcPr/>
-          <w:p>
-            <w:pPr>
-              <w:pStyle w:val="Compact"/>
-            </w:pPr>
-            <w:r>
-              <w:t xml:space="preserve">5.0V</w:t>
-            </w:r>
-          </w:p>
-        </w:tc>
-        <w:tc>
-          <w:tcPr/>
-          <w:p>
-            <w:pPr>
-              <w:pStyle w:val="Compact"/>
-            </w:pPr>
-            <w:r>
-              <w:t xml:space="preserve">USB-C connector</w:t>
-            </w:r>
-          </w:p>
-        </w:tc>
-        <w:tc>
-          <w:tcPr/>
-          <w:p>
-            <w:pPr>
-              <w:pStyle w:val="Compact"/>
-            </w:pPr>
-            <w:r>
-              <w:t xml:space="preserve">Max 500 mA per USB spec</w:t>
-            </w:r>
-          </w:p>
-        </w:tc>
-      </w:tr>
-      <w:tr>
-        <w:tc>
-          <w:tcPr/>
-          <w:p>
-            <w:pPr>
-              <w:pStyle w:val="Compact"/>
-            </w:pPr>
-            <w:r>
-              <w:t xml:space="preserve">3V3</w:t>
-            </w:r>
-          </w:p>
-        </w:tc>
-        <w:tc>
-          <w:tcPr/>
-          <w:p>
-            <w:pPr>
-              <w:pStyle w:val="Compact"/>
-            </w:pPr>
-            <w:r>
-              <w:t xml:space="preserve">3.3V</w:t>
-            </w:r>
-          </w:p>
-        </w:tc>
-        <w:tc>
-          <w:tcPr/>
-          <w:p>
-            <w:pPr>
-              <w:pStyle w:val="Compact"/>
-            </w:pPr>
-            <w:r>
-              <w:t xml:space="preserve">AMS1117-3.3 LDO</w:t>
-            </w:r>
-          </w:p>
-        </w:tc>
-        <w:tc>
-          <w:tcPr/>
-          <w:p>
-            <w:pPr>
-              <w:pStyle w:val="Compact"/>
-            </w:pPr>
-            <w:r>
-              <w:t xml:space="preserve">1A capacity; typical draw &lt;200 mA</w:t>
-            </w:r>
-          </w:p>
-        </w:tc>
-      </w:tr>
-      <w:tr>
-        <w:tc>
-          <w:tcPr/>
-          <w:p>
-            <w:pPr>
-              <w:pStyle w:val="Compact"/>
-            </w:pPr>
-            <w:r>
-              <w:t xml:space="preserve">GND</w:t>
-            </w:r>
-          </w:p>
-        </w:tc>
-        <w:tc>
-          <w:tcPr/>
-          <w:p>
-            <w:pPr>
-              <w:pStyle w:val="Compact"/>
-            </w:pPr>
-            <w:r>
-              <w:t xml:space="preserve">0V</w:t>
-            </w:r>
-          </w:p>
-        </w:tc>
-        <w:tc>
-          <w:tcPr/>
-          <w:p>
-            <w:pPr>
-              <w:pStyle w:val="Compact"/>
-            </w:pPr>
-            <w:r>
-              <w:t xml:space="preserve">Continuous ground plane</w:t>
-            </w:r>
-          </w:p>
-        </w:tc>
-        <w:tc>
-          <w:tcPr/>
-          <w:p>
-            <w:pPr>
-              <w:pStyle w:val="Compact"/>
-            </w:pPr>
+              <w:t xml:space="preserve">Connector</w:t>
+            </w:r>
+          </w:p>
+        </w:tc>
+        <w:tc>
+          <w:tcPr/>
+          <w:p>
+            <w:pPr>
+              <w:pStyle w:val="Compact"/>
+            </w:pPr>
+            <w:r>
+              <w:t xml:space="preserve">Sensor</w:t>
+            </w:r>
+          </w:p>
+        </w:tc>
+        <w:tc>
+          <w:tcPr/>
+          <w:p>
+            <w:pPr>
+              <w:pStyle w:val="Compact"/>
+            </w:pPr>
+            <w:r>
+              <w:t xml:space="preserve">Op-Amp Channel</w:t>
+            </w:r>
+          </w:p>
+        </w:tc>
+        <w:tc>
+          <w:tcPr/>
+          <w:p>
+            <w:pPr>
+              <w:pStyle w:val="Compact"/>
+            </w:pPr>
+            <w:r>
+              <w:t xml:space="preserve">ADS1115 Input</w:t>
+            </w:r>
+          </w:p>
+        </w:tc>
+      </w:tr>
+      <w:tr>
+        <w:tc>
+          <w:tcPr/>
+          <w:p>
+            <w:pPr>
+              <w:pStyle w:val="Compact"/>
+            </w:pPr>
+            <w:r>
+              <w:t xml:space="preserve">J2</w:t>
+            </w:r>
+          </w:p>
+        </w:tc>
+        <w:tc>
+          <w:tcPr/>
+          <w:p>
+            <w:pPr>
+              <w:pStyle w:val="Compact"/>
+            </w:pPr>
+            <w:r>
+              <w:t xml:space="preserve">Left Heel FlexiForce</w:t>
+            </w:r>
+          </w:p>
+        </w:tc>
+        <w:tc>
+          <w:tcPr/>
+          <w:p>
+            <w:pPr>
+              <w:pStyle w:val="Compact"/>
+            </w:pPr>
+            <w:r>
+              <w:t xml:space="preserve">MCP6004 Ch A</w:t>
+            </w:r>
+          </w:p>
+        </w:tc>
+        <w:tc>
+          <w:tcPr/>
+          <w:p>
+            <w:pPr>
+              <w:pStyle w:val="Compact"/>
+            </w:pPr>
+            <w:r>
+              <w:t xml:space="preserve">A0</w:t>
+            </w:r>
+          </w:p>
+        </w:tc>
+      </w:tr>
+      <w:tr>
+        <w:tc>
+          <w:tcPr/>
+          <w:p>
+            <w:pPr>
+              <w:pStyle w:val="Compact"/>
+            </w:pPr>
+            <w:r>
+              <w:t xml:space="preserve">J3</w:t>
+            </w:r>
+          </w:p>
+        </w:tc>
+        <w:tc>
+          <w:tcPr/>
+          <w:p>
+            <w:pPr>
+              <w:pStyle w:val="Compact"/>
+            </w:pPr>
+            <w:r>
+              <w:t xml:space="preserve">Left Toe FlexiForce</w:t>
+            </w:r>
+          </w:p>
+        </w:tc>
+        <w:tc>
+          <w:tcPr/>
+          <w:p>
+            <w:pPr>
+              <w:pStyle w:val="Compact"/>
+            </w:pPr>
+            <w:r>
+              <w:t xml:space="preserve">MCP6004 Ch B</w:t>
+            </w:r>
+          </w:p>
+        </w:tc>
+        <w:tc>
+          <w:tcPr/>
+          <w:p>
+            <w:pPr>
+              <w:pStyle w:val="Compact"/>
+            </w:pPr>
+            <w:r>
+              <w:t xml:space="preserve">A1</w:t>
+            </w:r>
+          </w:p>
+        </w:tc>
+      </w:tr>
+      <w:tr>
+        <w:tc>
+          <w:tcPr/>
+          <w:p>
+            <w:pPr>
+              <w:pStyle w:val="Compact"/>
+            </w:pPr>
+            <w:r>
+              <w:t xml:space="preserve">J4</w:t>
+            </w:r>
+          </w:p>
+        </w:tc>
+        <w:tc>
+          <w:tcPr/>
+          <w:p>
+            <w:pPr>
+              <w:pStyle w:val="Compact"/>
+            </w:pPr>
+            <w:r>
+              <w:t xml:space="preserve">Right Heel FlexiForce</w:t>
+            </w:r>
+          </w:p>
+        </w:tc>
+        <w:tc>
+          <w:tcPr/>
+          <w:p>
+            <w:pPr>
+              <w:pStyle w:val="Compact"/>
+            </w:pPr>
+            <w:r>
+              <w:t xml:space="preserve">MCP6004 Ch C</w:t>
+            </w:r>
+          </w:p>
+        </w:tc>
+        <w:tc>
+          <w:tcPr/>
+          <w:p>
+            <w:pPr>
+              <w:pStyle w:val="Compact"/>
+            </w:pPr>
+            <w:r>
+              <w:t xml:space="preserve">A2</w:t>
+            </w:r>
+          </w:p>
+        </w:tc>
+      </w:tr>
+      <w:tr>
+        <w:tc>
+          <w:tcPr/>
+          <w:p>
+            <w:pPr>
+              <w:pStyle w:val="Compact"/>
+            </w:pPr>
+            <w:r>
+              <w:t xml:space="preserve">J5</w:t>
+            </w:r>
+          </w:p>
+        </w:tc>
+        <w:tc>
+          <w:tcPr/>
+          <w:p>
+            <w:pPr>
+              <w:pStyle w:val="Compact"/>
+            </w:pPr>
+            <w:r>
+              <w:t xml:space="preserve">Right Toe FlexiForce</w:t>
+            </w:r>
+          </w:p>
+        </w:tc>
+        <w:tc>
+          <w:tcPr/>
+          <w:p>
+            <w:pPr>
+              <w:pStyle w:val="Compact"/>
+            </w:pPr>
+            <w:r>
+              <w:t xml:space="preserve">MCP6004 Ch D</w:t>
+            </w:r>
+          </w:p>
+        </w:tc>
+        <w:tc>
+          <w:tcPr/>
+          <w:p>
+            <w:pPr>
+              <w:pStyle w:val="Compact"/>
+            </w:pPr>
+            <w:r>
+              <w:t xml:space="preserve">A3</w:t>
+            </w:r>
           </w:p>
         </w:tc>
       </w:tr>
@@ -4251,39 +4597,25 @@
     <w:p>
       <w:pPr>
         <w:pStyle w:val="BodyText"/>
-      </w:pPr>
-      <w:r>
-        <w:t xml:space="preserve">Decoupling: 100nF + 10µF on LDO input and output. 100nF per IC VDD pin placed within 5mm.</w:t>
-      </w:r>
-    </w:p>
-    <w:p>
-      <w:r>
-        <w:pict>
-          <v:rect style="width:0;height:1.5pt" o:hralign="center" o:hrstd="t" o:hr="t"/>
-        </w:pict>
-      </w:r>
-    </w:p>
-    <w:bookmarkEnd w:id="25"/>
-    <w:bookmarkEnd w:id="26"/>
-    <w:bookmarkStart w:id="27" w:name="sensor-connectors"/>
-    <w:p>
-      <w:pPr>
-        <w:pStyle w:val="Heading2"/>
-      </w:pPr>
-      <w:r>
-        <w:t xml:space="preserve">Sensor Connectors</w:t>
-      </w:r>
-    </w:p>
-    <w:p>
-      <w:pPr>
-        <w:pStyle w:val="FirstParagraph"/>
       </w:pPr>
       <w:r>
         <w:rPr>
           <w:b/>
           <w:bCs/>
         </w:rPr>
-        <w:t xml:space="preserve">4× 2-pin 2.54mm female through-hole headers (J2–J5)</w:t>
+        <w:t xml:space="preserve">Each connector:</w:t>
+      </w:r>
+      <w:r>
+        <w:t xml:space="preserve"> </w:t>
+      </w:r>
+      <w:r>
+        <w:t xml:space="preserve">- Pin 1: Sensor signal → 100 Ω series resistor → TVS clamp → MCP6004 IN+ (non-inverting input)</w:t>
+      </w:r>
+      <w:r>
+        <w:t xml:space="preserve"> </w:t>
+      </w:r>
+      <w:r>
+        <w:t xml:space="preserve">- Pin 2: GND</w:t>
       </w:r>
     </w:p>
     <w:p>
@@ -4291,13 +4623,41 @@
         <w:pStyle w:val="BodyText"/>
       </w:pPr>
       <w:r>
-        <w:t xml:space="preserve">The FlexiForce A301 terminates in 2 male square pins at 0.1” pitch. These plug directly into standard 2-pin female headers on the PCB — no adapter cables, no soldering to the sensor, easy swap for replacement.</w:t>
+        <w:rPr>
+          <w:b/>
+          <w:bCs/>
+        </w:rPr>
+        <w:t xml:space="preserve">Part:</w:t>
+      </w:r>
+      <w:r>
+        <w:t xml:space="preserve"> </w:t>
+      </w:r>
+      <w:r>
+        <w:t xml:space="preserve">2-pin 2.54mm female header, through-hole (LCSC C35165 or equivalent). Place J2–J5 along one board edge for clean cable routing.</w:t>
+      </w:r>
+    </w:p>
+    <w:bookmarkStart w:id="27" w:name="esd-protection-per-sensor-input"/>
+    <w:p>
+      <w:pPr>
+        <w:pStyle w:val="Heading3"/>
+      </w:pPr>
+      <w:r>
+        <w:t xml:space="preserve">ESD Protection (per sensor input)</w:t>
+      </w:r>
+    </w:p>
+    <w:p>
+      <w:pPr>
+        <w:pStyle w:val="FirstParagraph"/>
+      </w:pPr>
+      <w:r>
+        <w:t xml:space="preserve">Since FlexiForce sensors will be plugged and unplugged repeatedly during clinical use, each sensor input gets basic ESD/transient protection between the connector and the op-amp input:</w:t>
       </w:r>
     </w:p>
     <w:tbl>
       <w:tblPr>
         <w:tblStyle w:val="Table"/>
-        <w:tblW w:type="auto" w:w="0"/>
+        <w:tblW w:type="pct" w:w="5000"/>
+        <w:tblLayout w:type="fixed"/>
         <w:tblLook w:firstRow="1" w:lastRow="0" w:firstColumn="0" w:lastColumn="0" w:noHBand="0" w:noVBand="0" w:val="0020"/>
       </w:tblPr>
       <w:tblGrid>
@@ -4317,224 +4677,132 @@
               <w:pStyle w:val="Compact"/>
             </w:pPr>
             <w:r>
-              <w:t xml:space="preserve">Connector</w:t>
-            </w:r>
-          </w:p>
-        </w:tc>
-        <w:tc>
-          <w:tcPr/>
-          <w:p>
-            <w:pPr>
-              <w:pStyle w:val="Compact"/>
-            </w:pPr>
-            <w:r>
-              <w:t xml:space="preserve">Sensor</w:t>
-            </w:r>
-          </w:p>
-        </w:tc>
-        <w:tc>
-          <w:tcPr/>
-          <w:p>
-            <w:pPr>
-              <w:pStyle w:val="Compact"/>
-            </w:pPr>
-            <w:r>
-              <w:t xml:space="preserve">Op-Amp Channel</w:t>
-            </w:r>
-          </w:p>
-        </w:tc>
-        <w:tc>
-          <w:tcPr/>
-          <w:p>
-            <w:pPr>
-              <w:pStyle w:val="Compact"/>
-            </w:pPr>
-            <w:r>
-              <w:t xml:space="preserve">ADS1115 Input</w:t>
-            </w:r>
-          </w:p>
-        </w:tc>
-      </w:tr>
-      <w:tr>
-        <w:tc>
-          <w:tcPr/>
-          <w:p>
-            <w:pPr>
-              <w:pStyle w:val="Compact"/>
-            </w:pPr>
-            <w:r>
-              <w:t xml:space="preserve">J2</w:t>
-            </w:r>
-          </w:p>
-        </w:tc>
-        <w:tc>
-          <w:tcPr/>
-          <w:p>
-            <w:pPr>
-              <w:pStyle w:val="Compact"/>
-            </w:pPr>
-            <w:r>
-              <w:t xml:space="preserve">Left Heel FlexiForce</w:t>
-            </w:r>
-          </w:p>
-        </w:tc>
-        <w:tc>
-          <w:tcPr/>
-          <w:p>
-            <w:pPr>
-              <w:pStyle w:val="Compact"/>
-            </w:pPr>
-            <w:r>
-              <w:t xml:space="preserve">MCP6004 Ch A</w:t>
-            </w:r>
-          </w:p>
-        </w:tc>
-        <w:tc>
-          <w:tcPr/>
-          <w:p>
-            <w:pPr>
-              <w:pStyle w:val="Compact"/>
-            </w:pPr>
-            <w:r>
-              <w:t xml:space="preserve">A0</w:t>
-            </w:r>
-          </w:p>
-        </w:tc>
-      </w:tr>
-      <w:tr>
-        <w:tc>
-          <w:tcPr/>
-          <w:p>
-            <w:pPr>
-              <w:pStyle w:val="Compact"/>
-            </w:pPr>
-            <w:r>
-              <w:t xml:space="preserve">J3</w:t>
-            </w:r>
-          </w:p>
-        </w:tc>
-        <w:tc>
-          <w:tcPr/>
-          <w:p>
-            <w:pPr>
-              <w:pStyle w:val="Compact"/>
-            </w:pPr>
-            <w:r>
-              <w:t xml:space="preserve">Left Toe FlexiForce</w:t>
-            </w:r>
-          </w:p>
-        </w:tc>
-        <w:tc>
-          <w:tcPr/>
-          <w:p>
-            <w:pPr>
-              <w:pStyle w:val="Compact"/>
-            </w:pPr>
-            <w:r>
-              <w:t xml:space="preserve">MCP6004 Ch B</w:t>
-            </w:r>
-          </w:p>
-        </w:tc>
-        <w:tc>
-          <w:tcPr/>
-          <w:p>
-            <w:pPr>
-              <w:pStyle w:val="Compact"/>
-            </w:pPr>
-            <w:r>
-              <w:t xml:space="preserve">A1</w:t>
-            </w:r>
-          </w:p>
-        </w:tc>
-      </w:tr>
-      <w:tr>
-        <w:tc>
-          <w:tcPr/>
-          <w:p>
-            <w:pPr>
-              <w:pStyle w:val="Compact"/>
-            </w:pPr>
-            <w:r>
-              <w:t xml:space="preserve">J4</w:t>
-            </w:r>
-          </w:p>
-        </w:tc>
-        <w:tc>
-          <w:tcPr/>
-          <w:p>
-            <w:pPr>
-              <w:pStyle w:val="Compact"/>
-            </w:pPr>
-            <w:r>
-              <w:t xml:space="preserve">Right Heel FlexiForce</w:t>
-            </w:r>
-          </w:p>
-        </w:tc>
-        <w:tc>
-          <w:tcPr/>
-          <w:p>
-            <w:pPr>
-              <w:pStyle w:val="Compact"/>
-            </w:pPr>
-            <w:r>
-              <w:t xml:space="preserve">MCP6004 Ch C</w:t>
-            </w:r>
-          </w:p>
-        </w:tc>
-        <w:tc>
-          <w:tcPr/>
-          <w:p>
-            <w:pPr>
-              <w:pStyle w:val="Compact"/>
-            </w:pPr>
-            <w:r>
-              <w:t xml:space="preserve">A2</w:t>
-            </w:r>
-          </w:p>
-        </w:tc>
-      </w:tr>
-      <w:tr>
-        <w:tc>
-          <w:tcPr/>
-          <w:p>
-            <w:pPr>
-              <w:pStyle w:val="Compact"/>
-            </w:pPr>
-            <w:r>
-              <w:t xml:space="preserve">J5</w:t>
-            </w:r>
-          </w:p>
-        </w:tc>
-        <w:tc>
-          <w:tcPr/>
-          <w:p>
-            <w:pPr>
-              <w:pStyle w:val="Compact"/>
-            </w:pPr>
-            <w:r>
-              <w:t xml:space="preserve">Right Toe FlexiForce</w:t>
-            </w:r>
-          </w:p>
-        </w:tc>
-        <w:tc>
-          <w:tcPr/>
-          <w:p>
-            <w:pPr>
-              <w:pStyle w:val="Compact"/>
-            </w:pPr>
-            <w:r>
-              <w:t xml:space="preserve">MCP6004 Ch D</w:t>
-            </w:r>
-          </w:p>
-        </w:tc>
-        <w:tc>
-          <w:tcPr/>
-          <w:p>
-            <w:pPr>
-              <w:pStyle w:val="Compact"/>
-            </w:pPr>
-            <w:r>
-              <w:t xml:space="preserve">A3</w:t>
+              <w:t xml:space="preserve">Component</w:t>
+            </w:r>
+          </w:p>
+        </w:tc>
+        <w:tc>
+          <w:tcPr/>
+          <w:p>
+            <w:pPr>
+              <w:pStyle w:val="Compact"/>
+            </w:pPr>
+            <w:r>
+              <w:t xml:space="preserve">Value</w:t>
+            </w:r>
+          </w:p>
+        </w:tc>
+        <w:tc>
+          <w:tcPr/>
+          <w:p>
+            <w:pPr>
+              <w:pStyle w:val="Compact"/>
+            </w:pPr>
+            <w:r>
+              <w:t xml:space="preserve">Purpose</w:t>
+            </w:r>
+          </w:p>
+        </w:tc>
+        <w:tc>
+          <w:tcPr/>
+          <w:p>
+            <w:pPr>
+              <w:pStyle w:val="Compact"/>
+            </w:pPr>
+            <w:r>
+              <w:t xml:space="preserve">Placement</w:t>
+            </w:r>
+          </w:p>
+        </w:tc>
+      </w:tr>
+      <w:tr>
+        <w:tc>
+          <w:tcPr/>
+          <w:p>
+            <w:pPr>
+              <w:pStyle w:val="Compact"/>
+            </w:pPr>
+            <w:r>
+              <w:t xml:space="preserve">Resd (×4)</w:t>
+            </w:r>
+          </w:p>
+        </w:tc>
+        <w:tc>
+          <w:tcPr/>
+          <w:p>
+            <w:pPr>
+              <w:pStyle w:val="Compact"/>
+            </w:pPr>
+            <w:r>
+              <w:t xml:space="preserve">100 Ω</w:t>
+            </w:r>
+          </w:p>
+        </w:tc>
+        <w:tc>
+          <w:tcPr/>
+          <w:p>
+            <w:pPr>
+              <w:pStyle w:val="Compact"/>
+            </w:pPr>
+            <w:r>
+              <w:t xml:space="preserve">Series current-limit resistor on signal pin</w:t>
+            </w:r>
+          </w:p>
+        </w:tc>
+        <w:tc>
+          <w:tcPr/>
+          <w:p>
+            <w:pPr>
+              <w:pStyle w:val="Compact"/>
+            </w:pPr>
+            <w:r>
+              <w:t xml:space="preserve">Between J2–J5 pin 1 and TVS clamp</w:t>
+            </w:r>
+          </w:p>
+        </w:tc>
+      </w:tr>
+      <w:tr>
+        <w:tc>
+          <w:tcPr/>
+          <w:p>
+            <w:pPr>
+              <w:pStyle w:val="Compact"/>
+            </w:pPr>
+            <w:r>
+              <w:t xml:space="preserve">D_esd (×4)</w:t>
+            </w:r>
+          </w:p>
+        </w:tc>
+        <w:tc>
+          <w:tcPr/>
+          <w:p>
+            <w:pPr>
+              <w:pStyle w:val="Compact"/>
+            </w:pPr>
+            <w:r>
+              <w:t xml:space="preserve">PESD3V3L1BA</w:t>
+            </w:r>
+          </w:p>
+        </w:tc>
+        <w:tc>
+          <w:tcPr/>
+          <w:p>
+            <w:pPr>
+              <w:pStyle w:val="Compact"/>
+            </w:pPr>
+            <w:r>
+              <w:t xml:space="preserve">Unidirectional TVS diode, 3.3V working voltage, SOD-523 package</w:t>
+            </w:r>
+          </w:p>
+        </w:tc>
+        <w:tc>
+          <w:tcPr/>
+          <w:p>
+            <w:pPr>
+              <w:pStyle w:val="Compact"/>
+            </w:pPr>
+            <w:r>
+              <w:t xml:space="preserve">Between signal (after Resd) and GND, cathode to signal</w:t>
             </w:r>
           </w:p>
         </w:tc>
@@ -4545,41 +4813,7 @@
         <w:pStyle w:val="BodyText"/>
       </w:pPr>
       <w:r>
-        <w:rPr>
-          <w:b/>
-          <w:bCs/>
-        </w:rPr>
-        <w:t xml:space="preserve">Each connector:</w:t>
-      </w:r>
-      <w:r>
-        <w:t xml:space="preserve"> </w:t>
-      </w:r>
-      <w:r>
-        <w:t xml:space="preserve">- Pin 1: Sensor signal → MCP6004 IN+ (non-inverting input)</w:t>
-      </w:r>
-      <w:r>
-        <w:t xml:space="preserve"> </w:t>
-      </w:r>
-      <w:r>
-        <w:t xml:space="preserve">- Pin 2: GND</w:t>
-      </w:r>
-    </w:p>
-    <w:p>
-      <w:pPr>
-        <w:pStyle w:val="BodyText"/>
-      </w:pPr>
-      <w:r>
-        <w:rPr>
-          <w:b/>
-          <w:bCs/>
-        </w:rPr>
-        <w:t xml:space="preserve">Part:</w:t>
-      </w:r>
-      <w:r>
-        <w:t xml:space="preserve"> </w:t>
-      </w:r>
-      <w:r>
-        <w:t xml:space="preserve">2-pin 2.54mm female header, through-hole (LCSC C35165 or equivalent). Place J2–J5 along one board edge for clean cable routing.</w:t>
+        <w:t xml:space="preserve">This adds negligible noise (100 Ω against the op-amp’s MΩ-range input impedance is invisible) but clamps any static discharge or cable swap transient before it reaches the op-amp.</w:t>
       </w:r>
     </w:p>
     <w:p>
@@ -4590,7 +4824,8 @@
       </w:r>
     </w:p>
     <w:bookmarkEnd w:id="27"/>
-    <w:bookmarkStart w:id="29" w:name="bill-of-materials"/>
+    <w:bookmarkEnd w:id="28"/>
+    <w:bookmarkStart w:id="30" w:name="bill-of-materials"/>
     <w:p>
       <w:pPr>
         <w:pStyle w:val="Heading2"/>
@@ -4604,7 +4839,7 @@
         <w:pStyle w:val="FirstParagraph"/>
       </w:pPr>
       <w:r>
-        <w:t xml:space="preserve">All on-board components. Off-board parts (BNO055 breakout, FlexiForce sensors) are listed in a separate section below.</w:t>
+        <w:t xml:space="preserve">All components mount directly on the PCB. The only off-board items are the FlexiForce sensors themselves, which plug into the four front-edge headers.</w:t>
       </w:r>
     </w:p>
     <w:tbl>
@@ -4712,40 +4947,40 @@
               <w:pStyle w:val="Compact"/>
             </w:pPr>
             <w:r>
-              <w:t xml:space="preserve">AMS1117-3.3</w:t>
-            </w:r>
-          </w:p>
-        </w:tc>
-        <w:tc>
-          <w:tcPr/>
-          <w:p>
-            <w:pPr>
-              <w:pStyle w:val="Compact"/>
-            </w:pPr>
-            <w:r>
-              <w:t xml:space="preserve">3.3V LDO regulator</w:t>
-            </w:r>
-          </w:p>
-        </w:tc>
-        <w:tc>
-          <w:tcPr/>
-          <w:p>
-            <w:pPr>
-              <w:pStyle w:val="Compact"/>
-            </w:pPr>
-            <w:r>
-              <w:t xml:space="preserve">SOT-223</w:t>
-            </w:r>
-          </w:p>
-        </w:tc>
-        <w:tc>
-          <w:tcPr/>
-          <w:p>
-            <w:pPr>
-              <w:pStyle w:val="Compact"/>
-            </w:pPr>
-            <w:r>
-              <w:t xml:space="preserve">C6186</w:t>
+              <w:t xml:space="preserve">AP2112K-3.3TRG1</w:t>
+            </w:r>
+          </w:p>
+        </w:tc>
+        <w:tc>
+          <w:tcPr/>
+          <w:p>
+            <w:pPr>
+              <w:pStyle w:val="Compact"/>
+            </w:pPr>
+            <w:r>
+              <w:t xml:space="preserve">3.3V LDO regulator, 55 µA Iq, low dropout</w:t>
+            </w:r>
+          </w:p>
+        </w:tc>
+        <w:tc>
+          <w:tcPr/>
+          <w:p>
+            <w:pPr>
+              <w:pStyle w:val="Compact"/>
+            </w:pPr>
+            <w:r>
+              <w:t xml:space="preserve">SOT-25</w:t>
+            </w:r>
+          </w:p>
+        </w:tc>
+        <w:tc>
+          <w:tcPr/>
+          <w:p>
+            <w:pPr>
+              <w:pStyle w:val="Compact"/>
+            </w:pPr>
+            <w:r>
+              <w:t xml:space="preserve">C51118</w:t>
             </w:r>
           </w:p>
         </w:tc>
@@ -7549,6 +7784,142 @@
           </w:p>
         </w:tc>
       </w:tr>
+      <w:tr>
+        <w:tc>
+          <w:tcPr/>
+          <w:p>
+            <w:pPr>
+              <w:pStyle w:val="Compact"/>
+            </w:pPr>
+            <w:r>
+              <w:t xml:space="preserve">Resd1–Resd4</w:t>
+            </w:r>
+          </w:p>
+        </w:tc>
+        <w:tc>
+          <w:tcPr/>
+          <w:p>
+            <w:pPr>
+              <w:pStyle w:val="Compact"/>
+            </w:pPr>
+            <w:r>
+              <w:t xml:space="preserve">100 Ω</w:t>
+            </w:r>
+          </w:p>
+        </w:tc>
+        <w:tc>
+          <w:tcPr/>
+          <w:p>
+            <w:pPr>
+              <w:pStyle w:val="Compact"/>
+            </w:pPr>
+            <w:r>
+              <w:t xml:space="preserve">Sensor input series resistor (ESD current limit)</w:t>
+            </w:r>
+          </w:p>
+        </w:tc>
+        <w:tc>
+          <w:tcPr/>
+          <w:p>
+            <w:pPr>
+              <w:pStyle w:val="Compact"/>
+            </w:pPr>
+            <w:r>
+              <w:t xml:space="preserve">0402</w:t>
+            </w:r>
+          </w:p>
+        </w:tc>
+        <w:tc>
+          <w:tcPr/>
+          <w:p>
+            <w:pPr>
+              <w:pStyle w:val="Compact"/>
+            </w:pPr>
+            <w:r>
+              <w:t xml:space="preserve">C25092</w:t>
+            </w:r>
+          </w:p>
+        </w:tc>
+        <w:tc>
+          <w:tcPr/>
+          <w:p>
+            <w:pPr>
+              <w:pStyle w:val="Compact"/>
+            </w:pPr>
+            <w:r>
+              <w:t xml:space="preserve">4</w:t>
+            </w:r>
+          </w:p>
+        </w:tc>
+      </w:tr>
+      <w:tr>
+        <w:tc>
+          <w:tcPr/>
+          <w:p>
+            <w:pPr>
+              <w:pStyle w:val="Compact"/>
+            </w:pPr>
+            <w:r>
+              <w:t xml:space="preserve">Desd1–Desd4</w:t>
+            </w:r>
+          </w:p>
+        </w:tc>
+        <w:tc>
+          <w:tcPr/>
+          <w:p>
+            <w:pPr>
+              <w:pStyle w:val="Compact"/>
+            </w:pPr>
+            <w:r>
+              <w:t xml:space="preserve">PESD3V3L1BA</w:t>
+            </w:r>
+          </w:p>
+        </w:tc>
+        <w:tc>
+          <w:tcPr/>
+          <w:p>
+            <w:pPr>
+              <w:pStyle w:val="Compact"/>
+            </w:pPr>
+            <w:r>
+              <w:t xml:space="preserve">Unidirectional TVS diode, 3.3V clamping</w:t>
+            </w:r>
+          </w:p>
+        </w:tc>
+        <w:tc>
+          <w:tcPr/>
+          <w:p>
+            <w:pPr>
+              <w:pStyle w:val="Compact"/>
+            </w:pPr>
+            <w:r>
+              <w:t xml:space="preserve">SOD-523</w:t>
+            </w:r>
+          </w:p>
+        </w:tc>
+        <w:tc>
+          <w:tcPr/>
+          <w:p>
+            <w:pPr>
+              <w:pStyle w:val="Compact"/>
+            </w:pPr>
+            <w:r>
+              <w:t xml:space="preserve">C129319</w:t>
+            </w:r>
+          </w:p>
+        </w:tc>
+        <w:tc>
+          <w:tcPr/>
+          <w:p>
+            <w:pPr>
+              <w:pStyle w:val="Compact"/>
+            </w:pPr>
+            <w:r>
+              <w:t xml:space="preserve">4</w:t>
+            </w:r>
+          </w:p>
+        </w:tc>
+      </w:tr>
     </w:tbl>
     <w:p>
       <w:pPr>
@@ -7558,7 +7929,7 @@
         <w:t xml:space="preserve">Estimated per-board cost: ~$15 in components plus ~$2–5 PCB fabrication (JLCPCB 5-piece minimum).</w:t>
       </w:r>
     </w:p>
-    <w:bookmarkStart w:id="28" w:name="off-board-parts-not-on-pcb"/>
+    <w:bookmarkStart w:id="29" w:name="off-board-parts-not-on-pcb"/>
     <w:p>
       <w:pPr>
         <w:pStyle w:val="Heading3"/>
@@ -7658,7 +8029,7 @@
         <w:pStyle w:val="BodyText"/>
       </w:pPr>
       <w:r>
-        <w:t xml:space="preserve">The IMU is now integrated directly on the PCB — no separate module to purchase or socket.</w:t>
+        <w:t xml:space="preserve">The IMU is integrated directly on the PCB — no separate module to purchase.</w:t>
       </w:r>
     </w:p>
     <w:p>
@@ -7668,9 +8039,9 @@
         </w:pict>
       </w:r>
     </w:p>
-    <w:bookmarkEnd w:id="28"/>
     <w:bookmarkEnd w:id="29"/>
-    <w:bookmarkStart w:id="35" w:name="pcb-layout-guidelines"/>
+    <w:bookmarkEnd w:id="30"/>
+    <w:bookmarkStart w:id="36" w:name="pcb-layout-guidelines"/>
     <w:p>
       <w:pPr>
         <w:pStyle w:val="Heading2"/>
@@ -7679,7 +8050,7 @@
         <w:t xml:space="preserve">PCB Layout Guidelines</w:t>
       </w:r>
     </w:p>
-    <w:bookmarkStart w:id="30" w:name="analog-signal-routing-critical"/>
+    <w:bookmarkStart w:id="31" w:name="analog-signal-routing-critical"/>
     <w:p>
       <w:pPr>
         <w:pStyle w:val="Heading3"/>
@@ -7798,8 +8169,8 @@
         <w:t xml:space="preserve">— J2–J5 along one edge for easy cable routing.</w:t>
       </w:r>
     </w:p>
-    <w:bookmarkEnd w:id="30"/>
-    <w:bookmarkStart w:id="31" w:name="suggested-component-placement"/>
+    <w:bookmarkEnd w:id="31"/>
+    <w:bookmarkStart w:id="32" w:name="suggested-component-placement"/>
     <w:p>
       <w:pPr>
         <w:pStyle w:val="Heading3"/>
@@ -7927,8 +8298,8 @@
         <w:t xml:space="preserve">└────────────────────────────────────────┘</w:t>
       </w:r>
     </w:p>
-    <w:bookmarkEnd w:id="31"/>
-    <w:bookmarkStart w:id="32" w:name="trace-via-specifications"/>
+    <w:bookmarkEnd w:id="32"/>
+    <w:bookmarkStart w:id="33" w:name="trace-via-specifications"/>
     <w:p>
       <w:pPr>
         <w:pStyle w:val="Heading3"/>
@@ -7997,8 +8368,8 @@
         <w:t xml:space="preserve">2-layer, 1oz copper</w:t>
       </w:r>
     </w:p>
-    <w:bookmarkEnd w:id="32"/>
-    <w:bookmarkStart w:id="33" w:name="esp32-antenna-keep-out"/>
+    <w:bookmarkEnd w:id="33"/>
+    <w:bookmarkStart w:id="34" w:name="esp32-antenna-keep-out"/>
     <w:p>
       <w:pPr>
         <w:pStyle w:val="Heading3"/>
@@ -8015,8 +8386,8 @@
         <w:t xml:space="preserve">No copper (traces or ground plane) within 10mm of the ESP32 antenna end. The module should be oriented so the antenna overhangs the board edge or has a dedicated clear zone.</w:t>
       </w:r>
     </w:p>
-    <w:bookmarkEnd w:id="33"/>
-    <w:bookmarkStart w:id="34" w:name="imu-placement"/>
+    <w:bookmarkEnd w:id="34"/>
+    <w:bookmarkStart w:id="35" w:name="imu-placement"/>
     <w:p>
       <w:pPr>
         <w:pStyle w:val="Heading3"/>
@@ -8040,9 +8411,9 @@
         </w:pict>
       </w:r>
     </w:p>
-    <w:bookmarkEnd w:id="34"/>
     <w:bookmarkEnd w:id="35"/>
-    <w:bookmarkStart w:id="36" w:name="calibration-procedure-post-assembly"/>
+    <w:bookmarkEnd w:id="36"/>
+    <w:bookmarkStart w:id="37" w:name="calibration-procedure-post-assembly"/>
     <w:p>
       <w:pPr>
         <w:pStyle w:val="Heading2"/>
@@ -8144,8 +8515,8 @@
         </w:pict>
       </w:r>
     </w:p>
-    <w:bookmarkEnd w:id="36"/>
-    <w:bookmarkStart w:id="45" w:name="testing-checklist"/>
+    <w:bookmarkEnd w:id="37"/>
+    <w:bookmarkStart w:id="46" w:name="testing-checklist"/>
     <w:p>
       <w:pPr>
         <w:pStyle w:val="Heading2"/>
@@ -8154,7 +8525,7 @@
         <w:t xml:space="preserve">Testing Checklist</w:t>
       </w:r>
     </w:p>
-    <w:bookmarkStart w:id="37" w:name="power-on"/>
+    <w:bookmarkStart w:id="38" w:name="power-on"/>
     <w:p>
       <w:pPr>
         <w:pStyle w:val="Heading3"/>
@@ -8199,8 +8570,8 @@
         <w:t xml:space="preserve">Current draw &lt;100 mA with no BLE connection</w:t>
       </w:r>
     </w:p>
-    <w:bookmarkEnd w:id="37"/>
-    <w:bookmarkStart w:id="38" w:name="vref-verification"/>
+    <w:bookmarkEnd w:id="38"/>
+    <w:bookmarkStart w:id="39" w:name="vref-verification"/>
     <w:p>
       <w:pPr>
         <w:pStyle w:val="Heading3"/>
@@ -8221,8 +8592,8 @@
         <w:t xml:space="preserve">Measure Vref node: 0.55–0.60 V</w:t>
       </w:r>
     </w:p>
-    <w:bookmarkEnd w:id="38"/>
-    <w:bookmarkStart w:id="39" w:name="op-amp-verification-sensors-disconnected"/>
+    <w:bookmarkEnd w:id="39"/>
+    <w:bookmarkStart w:id="40" w:name="op-amp-verification-sensors-disconnected"/>
     <w:p>
       <w:pPr>
         <w:pStyle w:val="Heading3"/>
@@ -8267,8 +8638,8 @@
         <w:t xml:space="preserve">Op-amp outputs (pins 1, 7, 8, 13): ~0 V with no sensor current</w:t>
       </w:r>
     </w:p>
-    <w:bookmarkEnd w:id="39"/>
-    <w:bookmarkStart w:id="40" w:name="i²c-adc-verification"/>
+    <w:bookmarkEnd w:id="40"/>
+    <w:bookmarkStart w:id="41" w:name="i²c-adc-verification"/>
     <w:p>
       <w:pPr>
         <w:pStyle w:val="Heading3"/>
@@ -8313,8 +8684,8 @@
         <w:t xml:space="preserve">Channels respond smoothly when a test voltage is applied</w:t>
       </w:r>
     </w:p>
-    <w:bookmarkEnd w:id="40"/>
-    <w:bookmarkStart w:id="41" w:name="imu-verification"/>
+    <w:bookmarkEnd w:id="41"/>
+    <w:bookmarkStart w:id="42" w:name="imu-verification"/>
     <w:p>
       <w:pPr>
         <w:pStyle w:val="Heading3"/>
@@ -8407,8 +8778,8 @@
         <w:t xml:space="preserve">No cross-coupling (pitch changes don’t affect roll, etc.)</w:t>
       </w:r>
     </w:p>
-    <w:bookmarkEnd w:id="41"/>
-    <w:bookmarkStart w:id="42" w:name="Xe98e425ba97635db5e7825eab74addf1b3bc20d"/>
+    <w:bookmarkEnd w:id="42"/>
+    <w:bookmarkStart w:id="43" w:name="Xe98e425ba97635db5e7825eab74addf1b3bc20d"/>
     <w:p>
       <w:pPr>
         <w:pStyle w:val="Heading3"/>
@@ -8453,8 +8824,8 @@
         <w:t xml:space="preserve">Full standing bodyweight: ~13,000 counts for ~800 N — no saturation</w:t>
       </w:r>
     </w:p>
-    <w:bookmarkEnd w:id="42"/>
-    <w:bookmarkStart w:id="43" w:name="ble-verification"/>
+    <w:bookmarkEnd w:id="43"/>
+    <w:bookmarkStart w:id="44" w:name="ble-verification"/>
     <w:p>
       <w:pPr>
         <w:pStyle w:val="Heading3"/>
@@ -8505,8 +8876,8 @@
         <w:t xml:space="preserve">50 Hz data rate confirmed</w:t>
       </w:r>
     </w:p>
-    <w:bookmarkEnd w:id="43"/>
-    <w:bookmarkStart w:id="44" w:name="clinical-verification"/>
+    <w:bookmarkEnd w:id="44"/>
+    <w:bookmarkStart w:id="45" w:name="clinical-verification"/>
     <w:p>
       <w:pPr>
         <w:pStyle w:val="Heading3"/>
@@ -8570,9 +8941,9 @@
         </w:pict>
       </w:r>
     </w:p>
-    <w:bookmarkEnd w:id="44"/>
     <w:bookmarkEnd w:id="45"/>
-    <w:bookmarkStart w:id="46" w:name="reference-datasheets"/>
+    <w:bookmarkEnd w:id="46"/>
+    <w:bookmarkStart w:id="47" w:name="reference-datasheets"/>
     <w:p>
       <w:pPr>
         <w:pStyle w:val="Heading2"/>
@@ -8747,7 +9118,7 @@
               <w:pStyle w:val="Compact"/>
             </w:pPr>
             <w:r>
-              <w:t xml:space="preserve">Adafruit BNO055 breakout</w:t>
+              <w:t xml:space="preserve">Adafruit BNO055 reference design (for layout hints)</w:t>
             </w:r>
           </w:p>
         </w:tc>
@@ -8819,18 +9190,42 @@
               <w:pStyle w:val="Compact"/>
             </w:pPr>
             <w:r>
-              <w:t xml:space="preserve">AMS1117-3.3</w:t>
-            </w:r>
-          </w:p>
-        </w:tc>
-        <w:tc>
-          <w:tcPr/>
-          <w:p>
-            <w:pPr>
-              <w:pStyle w:val="Compact"/>
-            </w:pPr>
-            <w:r>
-              <w:t xml:space="preserve">https://www.advanced-monolithic.com/pdf/noch/ams1117.pdf</w:t>
+              <w:t xml:space="preserve">AP2112K-3.3</w:t>
+            </w:r>
+          </w:p>
+        </w:tc>
+        <w:tc>
+          <w:tcPr/>
+          <w:p>
+            <w:pPr>
+              <w:pStyle w:val="Compact"/>
+            </w:pPr>
+            <w:r>
+              <w:t xml:space="preserve">https://www.diodes.com/assets/Datasheets/AP2112.pdf</w:t>
+            </w:r>
+          </w:p>
+        </w:tc>
+      </w:tr>
+      <w:tr>
+        <w:tc>
+          <w:tcPr/>
+          <w:p>
+            <w:pPr>
+              <w:pStyle w:val="Compact"/>
+            </w:pPr>
+            <w:r>
+              <w:t xml:space="preserve">PESD3V3L1BA (TVS)</w:t>
+            </w:r>
+          </w:p>
+        </w:tc>
+        <w:tc>
+          <w:tcPr/>
+          <w:p>
+            <w:pPr>
+              <w:pStyle w:val="Compact"/>
+            </w:pPr>
+            <w:r>
+              <w:t xml:space="preserve">https://www.nexperia.com/products/esd-protection-and-emi-filtering/esd-protection-diodes/PESD3V3L1BA.html</w:t>
             </w:r>
           </w:p>
         </w:tc>
@@ -8843,8 +9238,8 @@
         </w:pict>
       </w:r>
     </w:p>
-    <w:bookmarkEnd w:id="46"/>
-    <w:bookmarkStart w:id="47" w:name="dual-mode-operation-note"/>
+    <w:bookmarkEnd w:id="47"/>
+    <w:bookmarkStart w:id="48" w:name="dual-mode-operation-note"/>
     <w:p>
       <w:pPr>
         <w:pStyle w:val="Heading2"/>
@@ -9009,8 +9404,8 @@
         </w:pict>
       </w:r>
     </w:p>
-    <w:bookmarkEnd w:id="47"/>
-    <w:bookmarkStart w:id="48" w:name="deliverables-expected"/>
+    <w:bookmarkEnd w:id="48"/>
+    <w:bookmarkStart w:id="49" w:name="deliverables-expected"/>
     <w:p>
       <w:pPr>
         <w:pStyle w:val="Heading2"/>
@@ -9160,8 +9555,8 @@
         <w:t xml:space="preserve">deanarvan@gmail.com</w:t>
       </w:r>
     </w:p>
-    <w:bookmarkEnd w:id="48"/>
     <w:bookmarkEnd w:id="49"/>
+    <w:bookmarkEnd w:id="50"/>
     <w:sectPr>
       <w:footnotePr>
         <w:numRestart w:val="eachSect"/>

</xml_diff>